<commit_message>
added g2 of the *speckle* and not of the focused point, looks good
</commit_message>
<xml_diff>
--- a/submission/Submission_Omer.docx
+++ b/submission/Submission_Omer.docx
@@ -5005,6 +5005,73 @@
       <w:pPr>
         <w:spacing w:after="240"/>
       </w:pPr>
+    </w:p>
+    <w:p>
+      <w:pPr>
+        <w:pStyle w:val="Heading2"/>
+      </w:pPr>
+      <w:r>
+        <w:t>6.4 Further Propagation: Output Speckle G2(tau)</w:t>
+      </w:r>
+    </w:p>
+    <w:p>
+      <w:r>
+        <w:t>Both the corrected and uncorrected outputs are further propagated forward by 2*epsilon of free space (no aberration/correction planes) past the plane where they were originally brought back to focus, to test how each speckle pattern decorrelates once it leaves that plane.</w:t>
+      </w:r>
+    </w:p>
+    <w:p>
+      <w:r>
+        <w:t>Hypothesis: the corrected path's tighter, near-diffraction-limited focus is more sensitive to the residual mismatch between the fixed t=0 correction and the actual, time-varying tissue, and so should decorrelate faster than the already-diffuse uncorrected path.</w:t>
+      </w:r>
+    </w:p>
+    <w:p>
+      <w:r>
+        <w:t>Result: the opposite was observed. Both g2(tau) curves decay at a similar overall rate (from 1.00 at tau=0 to approximately 0.75-0.81 at tau=4.0 s), but the corrected path remains consistently above the uncorrected one at every tau &gt; 0 -- i.e. the uncorrected path decorrelates marginally faster.</w:t>
+      </w:r>
+    </w:p>
+    <w:p>
+      <w:pPr>
+        <w:jc w:val="center"/>
+      </w:pPr>
+      <w:r>
+        <w:drawing>
+          <wp:inline xmlns:a="http://schemas.openxmlformats.org/drawingml/2006/main" xmlns:pic="http://schemas.openxmlformats.org/drawingml/2006/picture">
+            <wp:extent cx="4114800" cy="3703320"/>
+            <wp:docPr id="1126700695" name="Picture 1126700695"/>
+            <wp:cNvGraphicFramePr>
+              <a:graphicFrameLocks noChangeAspect="1"/>
+            </wp:cNvGraphicFramePr>
+            <a:graphic>
+              <a:graphicData uri="http://schemas.openxmlformats.org/drawingml/2006/picture">
+                <pic:pic>
+                  <pic:nvPicPr>
+                    <pic:cNvPr id="0" name="speckle_correlation_statistics_propagated2eps.png"/>
+                    <pic:cNvPicPr/>
+                  </pic:nvPicPr>
+                  <pic:blipFill>
+                    <a:blip r:embed="rId17"/>
+                    <a:stretch>
+                      <a:fillRect/>
+                    </a:stretch>
+                  </pic:blipFill>
+                  <pic:spPr>
+                    <a:xfrm>
+                      <a:off x="0" y="0"/>
+                      <a:ext cx="4114800" cy="3703320"/>
+                    </a:xfrm>
+                    <a:prstGeom prst="rect"/>
+                  </pic:spPr>
+                </pic:pic>
+              </a:graphicData>
+            </a:graphic>
+          </wp:inline>
+        </w:drawing>
+      </w:r>
+    </w:p>
+    <w:p>
+      <w:r>
+        <w:t>Figure: g2(tau), spatially averaged and referenced to t=0, computed on the further-propagated field for both paths (same normalization and spatial-averaging convention as Section 6.1).</w:t>
+      </w:r>
     </w:p>
     <w:p>
       <w:pPr>

</xml_diff>